<commit_message>
Deploying to gh-pages from @ d-morrison/psw@b013384d09db2d95ff472e739c6f0dafd8ec4e03 🚀
</commit_message>
<xml_diff>
--- a/references.docx
+++ b/references.docx
@@ -15,7 +15,7 @@
         <w:pStyle w:val="Date"/>
       </w:pPr>
       <w:r>
-        <w:t xml:space="preserve">Last modified: 2026-06-18 19:25:05 (UTC)</w:t>
+        <w:t xml:space="preserve">Last modified: 2026-06-18 19:26:22 (UTC)</w:t>
       </w:r>
     </w:p>
     <w:bookmarkStart w:id="10" w:name="references"/>
@@ -88,7 +88,7 @@
         <w:t xml:space="preserve"> </w:t>
       </w:r>
       <w:r>
-        <w:t xml:space="preserve">3f0bb95</w:t>
+        <w:t xml:space="preserve">b013384</w:t>
       </w:r>
     </w:p>
     <w:p>
@@ -110,7 +110,7 @@
         <w:t xml:space="preserve"> </w:t>
       </w:r>
       <w:r>
-        <w:t xml:space="preserve">3f0bb95954119ed964cf13a4271003b5169b45b8</w:t>
+        <w:t xml:space="preserve">b013384d09db2d95ff472e739c6f0dafd8ec4e03</w:t>
       </w:r>
     </w:p>
     <w:p>
@@ -132,7 +132,7 @@
         <w:t xml:space="preserve"> </w:t>
       </w:r>
       <w:r>
-        <w:t xml:space="preserve">2026-06-18 12:24:53 -0700</w:t>
+        <w:t xml:space="preserve">2026-06-18 12:26:10 -0700</w:t>
       </w:r>
     </w:p>
     <w:p>

</xml_diff>

<commit_message>
Deploying to gh-pages from @ d-morrison/psw@c46923948a94a92365d5c592dac1ac3afce42641 🚀
</commit_message>
<xml_diff>
--- a/references.docx
+++ b/references.docx
@@ -15,7 +15,7 @@
         <w:pStyle w:val="Date"/>
       </w:pPr>
       <w:r>
-        <w:t xml:space="preserve">Last modified: 2026-06-18 19:26:22 (UTC)</w:t>
+        <w:t xml:space="preserve">Last modified: 2026-06-20 06:40:41 (UTC)</w:t>
       </w:r>
     </w:p>
     <w:bookmarkStart w:id="10" w:name="references"/>
@@ -88,7 +88,7 @@
         <w:t xml:space="preserve"> </w:t>
       </w:r>
       <w:r>
-        <w:t xml:space="preserve">b013384</w:t>
+        <w:t xml:space="preserve">c469239</w:t>
       </w:r>
     </w:p>
     <w:p>
@@ -110,7 +110,7 @@
         <w:t xml:space="preserve"> </w:t>
       </w:r>
       <w:r>
-        <w:t xml:space="preserve">b013384d09db2d95ff472e739c6f0dafd8ec4e03</w:t>
+        <w:t xml:space="preserve">c46923948a94a92365d5c592dac1ac3afce42641</w:t>
       </w:r>
     </w:p>
     <w:p>
@@ -132,7 +132,7 @@
         <w:t xml:space="preserve"> </w:t>
       </w:r>
       <w:r>
-        <w:t xml:space="preserve">2026-06-18 12:26:10 -0700</w:t>
+        <w:t xml:space="preserve">2026-06-19 23:40:31 -0700</w:t>
       </w:r>
     </w:p>
     <w:p>

</xml_diff>

<commit_message>
Deploying to gh-pages from @ d-morrison/psw@a3e327edc8d2645fde1d03ff7157b6045ebce477 🚀
</commit_message>
<xml_diff>
--- a/references.docx
+++ b/references.docx
@@ -15,7 +15,7 @@
         <w:pStyle w:val="Date"/>
       </w:pPr>
       <w:r>
-        <w:t xml:space="preserve">Last modified: 2026-06-20 06:47:42 (UTC)</w:t>
+        <w:t xml:space="preserve">Last modified: 2026-06-20 06:54:34 (UTC)</w:t>
       </w:r>
     </w:p>
     <w:bookmarkStart w:id="10" w:name="references"/>
@@ -88,7 +88,7 @@
         <w:t xml:space="preserve"> </w:t>
       </w:r>
       <w:r>
-        <w:t xml:space="preserve">65046a0</w:t>
+        <w:t xml:space="preserve">a3e327e</w:t>
       </w:r>
     </w:p>
     <w:p>
@@ -110,7 +110,7 @@
         <w:t xml:space="preserve"> </w:t>
       </w:r>
       <w:r>
-        <w:t xml:space="preserve">65046a0fa56407b458f1ca52ca6b052feb8d3452</w:t>
+        <w:t xml:space="preserve">a3e327edc8d2645fde1d03ff7157b6045ebce477</w:t>
       </w:r>
     </w:p>
     <w:p>
@@ -132,7 +132,7 @@
         <w:t xml:space="preserve"> </w:t>
       </w:r>
       <w:r>
-        <w:t xml:space="preserve">2026-06-19 23:47:29 -0700</w:t>
+        <w:t xml:space="preserve">2026-06-19 23:54:21 -0700</w:t>
       </w:r>
     </w:p>
     <w:p>

</xml_diff>

<commit_message>
Deploying to gh-pages from @ d-morrison/psw@e540bfae7a9d7f383d8433e7ef1f8492f0f2bdf6 🚀
</commit_message>
<xml_diff>
--- a/references.docx
+++ b/references.docx
@@ -15,7 +15,7 @@
         <w:pStyle w:val="Date"/>
       </w:pPr>
       <w:r>
-        <w:t xml:space="preserve">Last modified: 2026-06-20 06:54:34 (UTC)</w:t>
+        <w:t xml:space="preserve">Last modified: 2026-06-22 06:24:47 (UTC)</w:t>
       </w:r>
     </w:p>
     <w:bookmarkStart w:id="10" w:name="references"/>
@@ -88,7 +88,7 @@
         <w:t xml:space="preserve"> </w:t>
       </w:r>
       <w:r>
-        <w:t xml:space="preserve">a3e327e</w:t>
+        <w:t xml:space="preserve">e540bfa</w:t>
       </w:r>
     </w:p>
     <w:p>
@@ -110,7 +110,7 @@
         <w:t xml:space="preserve"> </w:t>
       </w:r>
       <w:r>
-        <w:t xml:space="preserve">a3e327edc8d2645fde1d03ff7157b6045ebce477</w:t>
+        <w:t xml:space="preserve">e540bfae7a9d7f383d8433e7ef1f8492f0f2bdf6</w:t>
       </w:r>
     </w:p>
     <w:p>
@@ -132,7 +132,7 @@
         <w:t xml:space="preserve"> </w:t>
       </w:r>
       <w:r>
-        <w:t xml:space="preserve">2026-06-19 23:54:21 -0700</w:t>
+        <w:t xml:space="preserve">2026-06-21 23:24:33 -0700</w:t>
       </w:r>
     </w:p>
     <w:p>

</xml_diff>

<commit_message>
Deploying to gh-pages from @ d-morrison/psw@572a353239b90318be84f0e6e7544ebd58b39e8e 🚀
</commit_message>
<xml_diff>
--- a/references.docx
+++ b/references.docx
@@ -15,7 +15,7 @@
         <w:pStyle w:val="Date"/>
       </w:pPr>
       <w:r>
-        <w:t xml:space="preserve">Last modified: 2026-06-22 06:24:47 (UTC)</w:t>
+        <w:t xml:space="preserve">Last modified: 2026-07-29 20:07:53 (UTC)</w:t>
       </w:r>
     </w:p>
     <w:bookmarkStart w:id="10" w:name="references"/>
@@ -88,7 +88,7 @@
         <w:t xml:space="preserve"> </w:t>
       </w:r>
       <w:r>
-        <w:t xml:space="preserve">e540bfa</w:t>
+        <w:t xml:space="preserve">572a353</w:t>
       </w:r>
     </w:p>
     <w:p>
@@ -110,7 +110,7 @@
         <w:t xml:space="preserve"> </w:t>
       </w:r>
       <w:r>
-        <w:t xml:space="preserve">e540bfae7a9d7f383d8433e7ef1f8492f0f2bdf6</w:t>
+        <w:t xml:space="preserve">572a353239b90318be84f0e6e7544ebd58b39e8e</w:t>
       </w:r>
     </w:p>
     <w:p>
@@ -132,7 +132,7 @@
         <w:t xml:space="preserve"> </w:t>
       </w:r>
       <w:r>
-        <w:t xml:space="preserve">2026-06-21 23:24:33 -0700</w:t>
+        <w:t xml:space="preserve">2026-07-29 13:07:39 -0700</w:t>
       </w:r>
     </w:p>
     <w:p>

</xml_diff>